<commit_message>
converted low, opt, high to match fitness patterns; now labeled low, medium.low, opt, respectively
</commit_message>
<xml_diff>
--- a/Knitted_Markdowns/Folsomia_candida.docx
+++ b/Knitted_Markdowns/Folsomia_candida.docx
@@ -442,14 +442,14 @@
       <w:r>
         <w:drawing>
           <wp:inline>
-            <wp:extent cx="5334000" cy="4267200"/>
+            <wp:extent cx="4620126" cy="3696101"/>
             <wp:effectExtent b="0" l="0" r="0" t="0"/>
             <wp:docPr descr="Figure 1. Histogram of fitness ( population growth, r ) values." title="" id="27" name="Picture"/>
             <a:graphic>
               <a:graphicData uri="http://schemas.openxmlformats.org/drawingml/2006/picture">
                 <pic:pic>
                   <pic:nvPicPr>
-                    <pic:cNvPr descr="/Users/sarah/Desktop/Baines%20Lab/DispNet-Temperature-Dependent-Dispersal/Knitted_Markdowns/Folsomia_candida_files/figure-docx/fitnessnormal-1.png" id="28" name="Picture"/>
+                    <pic:cNvPr descr="C:\Users\Celina%20Baines\Dropbox\Ongoing%20Research\DispNet\DispNet-Temperature-Dependent-Dispersal\Knitted_Markdowns\Folsomia_candida_files/figure-docx/fitnessnormal-1.png" id="28" name="Picture"/>
                     <pic:cNvPicPr>
                       <a:picLocks noChangeArrowheads="1" noChangeAspect="1"/>
                     </pic:cNvPicPr>
@@ -463,7 +463,7 @@
                   <pic:spPr bwMode="auto">
                     <a:xfrm>
                       <a:off x="0" y="0"/>
-                      <a:ext cx="5334000" cy="4267200"/>
+                      <a:ext cx="4620126" cy="3696101"/>
                     </a:xfrm>
                     <a:prstGeom prst="rect">
                       <a:avLst/>
@@ -497,14 +497,14 @@
       <w:r>
         <w:drawing>
           <wp:inline>
-            <wp:extent cx="5334000" cy="4267200"/>
+            <wp:extent cx="4620126" cy="3696101"/>
             <wp:effectExtent b="0" l="0" r="0" t="0"/>
             <wp:docPr descr="Figure 1. Histogram of square-root/log/log10 -transformed population growth, r values." title="" id="30" name="Picture"/>
             <a:graphic>
               <a:graphicData uri="http://schemas.openxmlformats.org/drawingml/2006/picture">
                 <pic:pic>
                   <pic:nvPicPr>
-                    <pic:cNvPr descr="/Users/sarah/Desktop/Baines%20Lab/DispNet-Temperature-Dependent-Dispersal/Knitted_Markdowns/Folsomia_candida_files/figure-docx/transformedfitnessnormal-1.png" id="31" name="Picture"/>
+                    <pic:cNvPr descr="C:\Users\Celina%20Baines\Dropbox\Ongoing%20Research\DispNet\DispNet-Temperature-Dependent-Dispersal\Knitted_Markdowns\Folsomia_candida_files/figure-docx/transformedfitnessnormal-1.png" id="31" name="Picture"/>
                     <pic:cNvPicPr>
                       <a:picLocks noChangeArrowheads="1" noChangeAspect="1"/>
                     </pic:cNvPicPr>
@@ -518,7 +518,7 @@
                   <pic:spPr bwMode="auto">
                     <a:xfrm>
                       <a:off x="0" y="0"/>
-                      <a:ext cx="5334000" cy="4267200"/>
+                      <a:ext cx="4620126" cy="3696101"/>
                     </a:xfrm>
                     <a:prstGeom prst="rect">
                       <a:avLst/>
@@ -552,14 +552,14 @@
       <w:r>
         <w:drawing>
           <wp:inline>
-            <wp:extent cx="5334000" cy="4267200"/>
+            <wp:extent cx="4620126" cy="3696101"/>
             <wp:effectExtent b="0" l="0" r="0" t="0"/>
             <wp:docPr descr="Figure 2. Boxplot of fitness ( population growth, r ), as a function of temperature treatment. low = 18 C, opt = 22 C, high = 26 C." title="" id="33" name="Picture"/>
             <a:graphic>
               <a:graphicData uri="http://schemas.openxmlformats.org/drawingml/2006/picture">
                 <pic:pic>
                   <pic:nvPicPr>
-                    <pic:cNvPr descr="/Users/sarah/Desktop/Baines%20Lab/DispNet-Temperature-Dependent-Dispersal/Knitted_Markdowns/Folsomia_candida_files/figure-docx/fitnessplotnormal-1.png" id="34" name="Picture"/>
+                    <pic:cNvPr descr="C:\Users\Celina%20Baines\Dropbox\Ongoing%20Research\DispNet\DispNet-Temperature-Dependent-Dispersal\Knitted_Markdowns\Folsomia_candida_files/figure-docx/fitnessplotnormal-1.png" id="34" name="Picture"/>
                     <pic:cNvPicPr>
                       <a:picLocks noChangeArrowheads="1" noChangeAspect="1"/>
                     </pic:cNvPicPr>
@@ -573,7 +573,7 @@
                   <pic:spPr bwMode="auto">
                     <a:xfrm>
                       <a:off x="0" y="0"/>
-                      <a:ext cx="5334000" cy="4267200"/>
+                      <a:ext cx="4620126" cy="3696101"/>
                     </a:xfrm>
                     <a:prstGeom prst="rect">
                       <a:avLst/>
@@ -717,34 +717,34 @@
         <w:rPr>
           <w:rStyle w:val="VerbatimChar"/>
         </w:rPr>
-        <w:t xml:space="preserve">##  contrast   estimate     SE df lower.CL upper.CL t.ratio p.value</w:t>
-      </w:r>
-      <w:r>
-        <w:br/>
-      </w:r>
-      <w:r>
-        <w:rPr>
-          <w:rStyle w:val="VerbatimChar"/>
-        </w:rPr>
-        <w:t xml:space="preserve">##  opt - high  -0.0199 0.0184 42 -0.05694   0.0172  -1.082  0.2853</w:t>
-      </w:r>
-      <w:r>
-        <w:br/>
-      </w:r>
-      <w:r>
-        <w:rPr>
-          <w:rStyle w:val="VerbatimChar"/>
-        </w:rPr>
-        <w:t xml:space="preserve">##  opt - low    0.0209 0.0184 42 -0.01616   0.0580   1.138  0.2615</w:t>
-      </w:r>
-      <w:r>
-        <w:br/>
-      </w:r>
-      <w:r>
-        <w:rPr>
-          <w:rStyle w:val="VerbatimChar"/>
-        </w:rPr>
-        <w:t xml:space="preserve">##  high - low   0.0408 0.0184 42  0.00372   0.0778   2.220  0.0318</w:t>
+        <w:t xml:space="preserve">##  contrast         estimate     SE df lower.CL upper.CL t.ratio p.value</w:t>
+      </w:r>
+      <w:r>
+        <w:br/>
+      </w:r>
+      <w:r>
+        <w:rPr>
+          <w:rStyle w:val="VerbatimChar"/>
+        </w:rPr>
+        <w:t xml:space="preserve">##  opt - low          0.0408 0.0184 42  0.00372   0.0778   2.220  0.0318</w:t>
+      </w:r>
+      <w:r>
+        <w:br/>
+      </w:r>
+      <w:r>
+        <w:rPr>
+          <w:rStyle w:val="VerbatimChar"/>
+        </w:rPr>
+        <w:t xml:space="preserve">##  opt - medium.low   0.0199 0.0184 42 -0.01719   0.0569   1.082  0.2853</w:t>
+      </w:r>
+      <w:r>
+        <w:br/>
+      </w:r>
+      <w:r>
+        <w:rPr>
+          <w:rStyle w:val="VerbatimChar"/>
+        </w:rPr>
+        <w:t xml:space="preserve">##  low - medium.low  -0.0209 0.0184 42 -0.05797   0.0162  -1.138  0.2615</w:t>
       </w:r>
       <w:r>
         <w:br/>
@@ -799,14 +799,14 @@
       <w:r>
         <w:drawing>
           <wp:inline>
-            <wp:extent cx="5334000" cy="4267200"/>
+            <wp:extent cx="4620126" cy="3696101"/>
             <wp:effectExtent b="0" l="0" r="0" t="0"/>
             <wp:docPr descr="Figure 1. Dispersal as a function of temperature treatment. low = 18 C, opt = 22 C, high = 26 C. Error bars represent 95% confidence intervals predicted from GLMM." title="" id="39" name="Picture"/>
             <a:graphic>
               <a:graphicData uri="http://schemas.openxmlformats.org/drawingml/2006/picture">
                 <pic:pic>
                   <pic:nvPicPr>
-                    <pic:cNvPr descr="/Users/sarah/Desktop/Baines%20Lab/DispNet-Temperature-Dependent-Dispersal/Knitted_Markdowns/Folsomia_candida_files/figure-docx/dispersalplot-1.png" id="40" name="Picture"/>
+                    <pic:cNvPr descr="C:\Users\Celina%20Baines\Dropbox\Ongoing%20Research\DispNet\DispNet-Temperature-Dependent-Dispersal\Knitted_Markdowns\Folsomia_candida_files/figure-docx/dispersalplot-1.png" id="40" name="Picture"/>
                     <pic:cNvPicPr>
                       <a:picLocks noChangeArrowheads="1" noChangeAspect="1"/>
                     </pic:cNvPicPr>
@@ -820,7 +820,7 @@
                   <pic:spPr bwMode="auto">
                     <a:xfrm>
                       <a:off x="0" y="0"/>
-                      <a:ext cx="5334000" cy="4267200"/>
+                      <a:ext cx="4620126" cy="3696101"/>
                     </a:xfrm>
                     <a:prstGeom prst="rect">
                       <a:avLst/>
@@ -1080,7 +1080,7 @@
               <a:graphicData uri="http://schemas.openxmlformats.org/drawingml/2006/picture">
                 <pic:pic>
                   <pic:nvPicPr>
-                    <pic:cNvPr descr="/Users/sarah/Desktop/Baines%20Lab/DispNet-Temperature-Dependent-Dispersal/Knitted_Markdowns/Folsomia_candida_files/figure-docx/modeldiagnosticsfitness-1.png" id="46" name="Picture"/>
+                    <pic:cNvPr descr="C:\Users\Celina%20Baines\Dropbox\Ongoing%20Research\DispNet\DispNet-Temperature-Dependent-Dispersal\Knitted_Markdowns\Folsomia_candida_files/figure-docx/modeldiagnosticsfitness-1.png" id="46" name="Picture"/>
                     <pic:cNvPicPr>
                       <a:picLocks noChangeArrowheads="1" noChangeAspect="1"/>
                     </pic:cNvPicPr>
@@ -1137,7 +1137,7 @@
               <a:graphicData uri="http://schemas.openxmlformats.org/drawingml/2006/picture">
                 <pic:pic>
                   <pic:nvPicPr>
-                    <pic:cNvPr descr="/Users/sarah/Desktop/Baines%20Lab/DispNet-Temperature-Dependent-Dispersal/Knitted_Markdowns/Folsomia_candida_files/figure-docx/modeldiagnosticsdispersal-1.png" id="50" name="Picture"/>
+                    <pic:cNvPr descr="C:\Users\Celina%20Baines\Dropbox\Ongoing%20Research\DispNet\DispNet-Temperature-Dependent-Dispersal\Knitted_Markdowns\Folsomia_candida_files/figure-docx/modeldiagnosticsdispersal-1.png" id="50" name="Picture"/>
                     <pic:cNvPicPr>
                       <a:picLocks noChangeArrowheads="1" noChangeAspect="1"/>
                     </pic:cNvPicPr>

</xml_diff>

<commit_message>
converted low, opt, high to match fitness pattern; now labeled low, medium.low, opt, respectively
</commit_message>
<xml_diff>
--- a/Knitted_Markdowns/Folsomia_candida.docx
+++ b/Knitted_Markdowns/Folsomia_candida.docx
@@ -966,34 +966,34 @@
         <w:rPr>
           <w:rStyle w:val="VerbatimChar"/>
         </w:rPr>
-        <w:t xml:space="preserve">##  contrast   odds.ratio    SE  df asymp.LCL asymp.UCL null z.ratio p.value</w:t>
-      </w:r>
-      <w:r>
-        <w:br/>
-      </w:r>
-      <w:r>
-        <w:rPr>
-          <w:rStyle w:val="VerbatimChar"/>
-        </w:rPr>
-        <w:t xml:space="preserve">##  opt / high      1.523 0.491 Inf     0.810     2.863    1   1.307  0.1914</w:t>
-      </w:r>
-      <w:r>
-        <w:br/>
-      </w:r>
-      <w:r>
-        <w:rPr>
-          <w:rStyle w:val="VerbatimChar"/>
-        </w:rPr>
-        <w:t xml:space="preserve">##  opt / low       0.609 0.177 Inf     0.344     1.078    1  -1.701  0.0889</w:t>
-      </w:r>
-      <w:r>
-        <w:br/>
-      </w:r>
-      <w:r>
-        <w:rPr>
-          <w:rStyle w:val="VerbatimChar"/>
-        </w:rPr>
-        <w:t xml:space="preserve">##  high / low      0.400 0.124 Inf     0.218     0.734    1  -2.956  0.0031</w:t>
+        <w:t xml:space="preserve">##  contrast         odds.ratio    SE  df asymp.LCL asymp.UCL null z.ratio p.value</w:t>
+      </w:r>
+      <w:r>
+        <w:br/>
+      </w:r>
+      <w:r>
+        <w:rPr>
+          <w:rStyle w:val="VerbatimChar"/>
+        </w:rPr>
+        <w:t xml:space="preserve">##  opt / low             0.400 0.124 Inf     0.218     0.734    1  -2.956  0.0031</w:t>
+      </w:r>
+      <w:r>
+        <w:br/>
+      </w:r>
+      <w:r>
+        <w:rPr>
+          <w:rStyle w:val="VerbatimChar"/>
+        </w:rPr>
+        <w:t xml:space="preserve">##  opt / medium.low      0.657 0.211 Inf     0.349     1.234    1  -1.307  0.1914</w:t>
+      </w:r>
+      <w:r>
+        <w:br/>
+      </w:r>
+      <w:r>
+        <w:rPr>
+          <w:rStyle w:val="VerbatimChar"/>
+        </w:rPr>
+        <w:t xml:space="preserve">##  low / medium.low      1.642 0.478 Inf     0.927     2.906    1   1.701  0.0889</w:t>
       </w:r>
       <w:r>
         <w:br/>

</xml_diff>